<commit_message>
add file docx in documentation folder
</commit_message>
<xml_diff>
--- a/documentation/templates.docx
+++ b/documentation/templates.docx
@@ -2,6 +2,98 @@
 <file path=word/document.xml><?xml version="1.0" encoding="utf-8"?>
 <w:document xmlns:wpc="http://schemas.microsoft.com/office/word/2010/wordprocessingCanvas" xmlns:cx="http://schemas.microsoft.com/office/drawing/2014/chartex" xmlns:cx1="http://schemas.microsoft.com/office/drawing/2015/9/8/chartex" xmlns:cx2="http://schemas.microsoft.com/office/drawing/2015/10/21/chartex" xmlns:cx3="http://schemas.microsoft.com/office/drawing/2016/5/9/chartex" xmlns:cx4="http://schemas.microsoft.com/office/drawing/2016/5/10/chartex" xmlns:cx5="http://schemas.microsoft.com/office/drawing/2016/5/11/chartex" xmlns:cx6="http://schemas.microsoft.com/office/drawing/2016/5/12/chartex" xmlns:cx7="http://schemas.microsoft.com/office/drawing/2016/5/13/chartex" xmlns:cx8="http://schemas.microsoft.com/office/drawing/2016/5/14/chartex" xmlns:mc="http://schemas.openxmlformats.org/markup-compatibility/2006" xmlns:aink="http://schemas.microsoft.com/office/drawing/2016/ink" xmlns:am3d="http://schemas.microsoft.com/office/drawing/2017/model3d" xmlns:o="urn:schemas-microsoft-com:office:office" xmlns:oel="http://schemas.microsoft.com/office/2019/extlst" xmlns:r="http://schemas.openxmlformats.org/officeDocument/2006/relationships" xmlns:m="http://schemas.openxmlformats.org/officeDocument/2006/math" xmlns:v="urn:schemas-microsoft-com:vml" xmlns:wp14="http://schemas.microsoft.com/office/word/2010/wordprocessingDrawing" xmlns:wp="http://schemas.openxmlformats.org/drawingml/2006/wordprocessingDrawing" xmlns:w10="urn:schemas-microsoft-com:office:word" xmlns:w="http://schemas.openxmlformats.org/wordprocessingml/2006/main" xmlns:w14="http://schemas.microsoft.com/office/word/2010/wordml" xmlns:w15="http://schemas.microsoft.com/office/word/2012/wordml" xmlns:w16cex="http://schemas.microsoft.com/office/word/2018/wordml/cex" xmlns:w16cid="http://schemas.microsoft.com/office/word/2016/wordml/cid" xmlns:w16="http://schemas.microsoft.com/office/word/2018/wordml" xmlns:w16du="http://schemas.microsoft.com/office/word/2023/wordml/word16du" xmlns:w16sdtdh="http://schemas.microsoft.com/office/word/2020/wordml/sdtdatahash" xmlns:w16sdtfl="http://schemas.microsoft.com/office/word/2024/wordml/sdtformatlock" xmlns:w16se="http://schemas.microsoft.com/office/word/2015/wordml/symex" xmlns:wpg="http://schemas.microsoft.com/office/word/2010/wordprocessingGroup" xmlns:wpi="http://schemas.microsoft.com/office/word/2010/wordprocessingInk" xmlns:wne="http://schemas.microsoft.com/office/word/2006/wordml" xmlns:wps="http://schemas.microsoft.com/office/word/2010/wordprocessingShape" mc:Ignorable="w14 w15 w16se w16cid w16 w16cex w16sdtdh w16sdtfl w16du wp14">
   <w:body>
+    <w:p>
+      <w:r>
+        <w:t>Page de connexion</w:t>
+      </w:r>
+    </w:p>
+    <w:p/>
+    <w:p>
+      <w:r>
+        <w:drawing>
+          <wp:anchor distT="0" distB="0" distL="114300" distR="114300" simplePos="0" relativeHeight="251673600" behindDoc="1" locked="0" layoutInCell="1" allowOverlap="1" wp14:anchorId="66397C8B" wp14:editId="7E1EC126">
+            <wp:simplePos x="0" y="0"/>
+            <wp:positionH relativeFrom="margin">
+              <wp:align>right</wp:align>
+            </wp:positionH>
+            <wp:positionV relativeFrom="paragraph">
+              <wp:posOffset>307096</wp:posOffset>
+            </wp:positionV>
+            <wp:extent cx="5760720" cy="4501661"/>
+            <wp:effectExtent l="0" t="0" r="0" b="0"/>
+            <wp:wrapNone/>
+            <wp:docPr id="876011663" name="Image 1"/>
+            <wp:cNvGraphicFramePr>
+              <a:graphicFrameLocks xmlns:a="http://schemas.openxmlformats.org/drawingml/2006/main" noChangeAspect="1"/>
+            </wp:cNvGraphicFramePr>
+            <a:graphic xmlns:a="http://schemas.openxmlformats.org/drawingml/2006/main">
+              <a:graphicData uri="http://schemas.openxmlformats.org/drawingml/2006/picture">
+                <pic:pic xmlns:pic="http://schemas.openxmlformats.org/drawingml/2006/picture">
+                  <pic:nvPicPr>
+                    <pic:cNvPr id="876011663" name=""/>
+                    <pic:cNvPicPr/>
+                  </pic:nvPicPr>
+                  <pic:blipFill>
+                    <a:blip r:embed="rId5">
+                      <a:extLst>
+                        <a:ext uri="{28A0092B-C50C-407E-A947-70E740481C1C}">
+                          <a14:useLocalDpi xmlns:a14="http://schemas.microsoft.com/office/drawing/2010/main" val="0"/>
+                        </a:ext>
+                      </a:extLst>
+                    </a:blip>
+                    <a:stretch>
+                      <a:fillRect/>
+                    </a:stretch>
+                  </pic:blipFill>
+                  <pic:spPr>
+                    <a:xfrm>
+                      <a:off x="0" y="0"/>
+                      <a:ext cx="5760720" cy="4501661"/>
+                    </a:xfrm>
+                    <a:prstGeom prst="rect">
+                      <a:avLst/>
+                    </a:prstGeom>
+                  </pic:spPr>
+                </pic:pic>
+              </a:graphicData>
+            </a:graphic>
+            <wp14:sizeRelV relativeFrom="margin">
+              <wp14:pctHeight>0</wp14:pctHeight>
+            </wp14:sizeRelV>
+          </wp:anchor>
+        </w:drawing>
+      </w:r>
+    </w:p>
+    <w:p/>
+    <w:p/>
+    <w:p/>
+    <w:p/>
+    <w:p/>
+    <w:p/>
+    <w:p/>
+    <w:p/>
+    <w:p/>
+    <w:p/>
+    <w:p/>
+    <w:p/>
+    <w:p/>
+    <w:p/>
+    <w:p/>
+    <w:p/>
+    <w:p/>
+    <w:p/>
+    <w:p/>
+    <w:p/>
+    <w:p/>
+    <w:p/>
+    <w:p/>
+    <w:p/>
+    <w:p/>
+    <w:p/>
+    <w:p/>
+    <w:p/>
+    <w:p/>
+    <w:p/>
     <w:p/>
     <w:p>
       <w:r>
@@ -9,6 +101,9 @@
       </w:r>
       <w:r>
         <w:t>accueil</w:t>
+      </w:r>
+      <w:r>
+        <w:t> :</w:t>
       </w:r>
     </w:p>
     <w:p>
@@ -37,7 +132,7 @@
                     <pic:cNvPicPr/>
                   </pic:nvPicPr>
                   <pic:blipFill>
-                    <a:blip r:embed="rId5" cstate="print">
+                    <a:blip r:embed="rId6" cstate="print">
                       <a:extLst>
                         <a:ext uri="{28A0092B-C50C-407E-A947-70E740481C1C}">
                           <a14:useLocalDpi xmlns:a14="http://schemas.microsoft.com/office/drawing/2010/main" val="0"/>
@@ -87,13 +182,16 @@
     <w:p/>
     <w:p>
       <w:r>
-        <w:t>Page liste des clients</w:t>
+        <w:t>Liste</w:t>
+      </w:r>
+      <w:r>
+        <w:t xml:space="preserve"> des clients</w:t>
       </w:r>
     </w:p>
     <w:p>
       <w:r>
         <w:drawing>
-          <wp:anchor distT="0" distB="0" distL="114300" distR="114300" simplePos="0" relativeHeight="251659264" behindDoc="1" locked="0" layoutInCell="1" allowOverlap="1" wp14:anchorId="72303B66" wp14:editId="5AD946FE">
+          <wp:anchor distT="0" distB="0" distL="114300" distR="114300" simplePos="0" relativeHeight="251659264" behindDoc="1" locked="0" layoutInCell="1" allowOverlap="1" wp14:anchorId="72303B66" wp14:editId="2B5F255F">
             <wp:simplePos x="0" y="0"/>
             <wp:positionH relativeFrom="margin">
               <wp:align>left</wp:align>
@@ -116,7 +214,7 @@
                     <pic:cNvPicPr/>
                   </pic:nvPicPr>
                   <pic:blipFill>
-                    <a:blip r:embed="rId6" cstate="print">
+                    <a:blip r:embed="rId7" cstate="print">
                       <a:extLst>
                         <a:ext uri="{28A0092B-C50C-407E-A947-70E740481C1C}">
                           <a14:useLocalDpi xmlns:a14="http://schemas.microsoft.com/office/drawing/2010/main" val="0"/>
@@ -195,7 +293,7 @@
                     </pic:cNvPicPr>
                   </pic:nvPicPr>
                   <pic:blipFill>
-                    <a:blip r:embed="rId7" cstate="print">
+                    <a:blip r:embed="rId8" cstate="print">
                       <a:extLst>
                         <a:ext uri="{28A0092B-C50C-407E-A947-70E740481C1C}">
                           <a14:useLocalDpi xmlns:a14="http://schemas.microsoft.com/office/drawing/2010/main" val="0"/>
@@ -230,28 +328,31 @@
         </w:drawing>
       </w:r>
       <w:r>
-        <w:t>Page</w:t>
-      </w:r>
-      <w:r>
-        <w:t xml:space="preserve"> liste des vendeurs</w:t>
-      </w:r>
-    </w:p>
-    <w:p/>
-    <w:p/>
-    <w:p/>
-    <w:p/>
-    <w:p/>
-    <w:p/>
-    <w:p/>
-    <w:p/>
-    <w:p/>
-    <w:p/>
-    <w:p/>
-    <w:p/>
-    <w:p/>
-    <w:p>
-      <w:r>
-        <w:t>Page liste des factures</w:t>
+        <w:t>Liste</w:t>
+      </w:r>
+      <w:r>
+        <w:t xml:space="preserve"> des vendeurs</w:t>
+      </w:r>
+    </w:p>
+    <w:p/>
+    <w:p/>
+    <w:p/>
+    <w:p/>
+    <w:p/>
+    <w:p/>
+    <w:p/>
+    <w:p/>
+    <w:p/>
+    <w:p/>
+    <w:p/>
+    <w:p/>
+    <w:p/>
+    <w:p>
+      <w:r>
+        <w:t>Liste</w:t>
+      </w:r>
+      <w:r>
+        <w:t xml:space="preserve"> des factures</w:t>
       </w:r>
     </w:p>
     <w:p>
@@ -280,7 +381,7 @@
                     <pic:cNvPicPr/>
                   </pic:nvPicPr>
                   <pic:blipFill>
-                    <a:blip r:embed="rId8" cstate="print">
+                    <a:blip r:embed="rId9" cstate="print">
                       <a:extLst>
                         <a:ext uri="{28A0092B-C50C-407E-A947-70E740481C1C}">
                           <a14:useLocalDpi xmlns:a14="http://schemas.microsoft.com/office/drawing/2010/main" val="0"/>
@@ -364,7 +465,7 @@
                     </pic:cNvPicPr>
                   </pic:nvPicPr>
                   <pic:blipFill>
-                    <a:blip r:embed="rId9">
+                    <a:blip r:embed="rId10">
                       <a:extLst>
                         <a:ext uri="{28A0092B-C50C-407E-A947-70E740481C1C}">
                           <a14:useLocalDpi xmlns:a14="http://schemas.microsoft.com/office/drawing/2010/main" val="0"/>
@@ -399,7 +500,7 @@
         </w:drawing>
       </w:r>
       <w:r>
-        <w:t>Page Détail client</w:t>
+        <w:t>Détail client</w:t>
       </w:r>
     </w:p>
     <w:p/>
@@ -448,7 +549,7 @@
                     <pic:cNvPicPr/>
                   </pic:nvPicPr>
                   <pic:blipFill>
-                    <a:blip r:embed="rId10">
+                    <a:blip r:embed="rId11">
                       <a:extLst>
                         <a:ext uri="{28A0092B-C50C-407E-A947-70E740481C1C}">
                           <a14:useLocalDpi xmlns:a14="http://schemas.microsoft.com/office/drawing/2010/main" val="0"/>
@@ -499,7 +600,7 @@
     <w:p/>
     <w:p>
       <w:r>
-        <w:t>Page Détail Vendeur</w:t>
+        <w:t>Détail Vendeur</w:t>
       </w:r>
     </w:p>
     <w:p>
@@ -528,7 +629,7 @@
                     <pic:cNvPicPr/>
                   </pic:nvPicPr>
                   <pic:blipFill>
-                    <a:blip r:embed="rId11">
+                    <a:blip r:embed="rId12">
                       <a:extLst>
                         <a:ext uri="{28A0092B-C50C-407E-A947-70E740481C1C}">
                           <a14:useLocalDpi xmlns:a14="http://schemas.microsoft.com/office/drawing/2010/main" val="0"/>
@@ -577,7 +678,7 @@
     <w:p/>
     <w:p>
       <w:r>
-        <w:t>Page de Modification d’un vendeur</w:t>
+        <w:t>Modification d’un vendeur</w:t>
       </w:r>
     </w:p>
     <w:p>
@@ -606,7 +707,7 @@
                     <pic:cNvPicPr/>
                   </pic:nvPicPr>
                   <pic:blipFill>
-                    <a:blip r:embed="rId12">
+                    <a:blip r:embed="rId13">
                       <a:extLst>
                         <a:ext uri="{28A0092B-C50C-407E-A947-70E740481C1C}">
                           <a14:useLocalDpi xmlns:a14="http://schemas.microsoft.com/office/drawing/2010/main" val="0"/>
@@ -656,7 +757,7 @@
     <w:p/>
     <w:p>
       <w:r>
-        <w:t>Page Détail Facture</w:t>
+        <w:t>Détail Facture</w:t>
       </w:r>
     </w:p>
     <w:p>
@@ -685,7 +786,7 @@
                     <pic:cNvPicPr/>
                   </pic:nvPicPr>
                   <pic:blipFill>
-                    <a:blip r:embed="rId13">
+                    <a:blip r:embed="rId14">
                       <a:extLst>
                         <a:ext uri="{28A0092B-C50C-407E-A947-70E740481C1C}">
                           <a14:useLocalDpi xmlns:a14="http://schemas.microsoft.com/office/drawing/2010/main" val="0"/>
@@ -756,7 +857,7 @@
                     <pic:cNvPicPr/>
                   </pic:nvPicPr>
                   <pic:blipFill>
-                    <a:blip r:embed="rId14">
+                    <a:blip r:embed="rId15">
                       <a:extLst>
                         <a:ext uri="{28A0092B-C50C-407E-A947-70E740481C1C}">
                           <a14:useLocalDpi xmlns:a14="http://schemas.microsoft.com/office/drawing/2010/main" val="0"/>
@@ -788,33 +889,31 @@
           </wp:anchor>
         </w:drawing>
       </w:r>
-      <w:proofErr w:type="gramStart"/>
-      <w:r>
-        <w:t>Page  Modifier</w:t>
-      </w:r>
-      <w:proofErr w:type="gramEnd"/>
-      <w:r>
-        <w:t xml:space="preserve"> une facture</w:t>
-      </w:r>
-    </w:p>
-    <w:p/>
-    <w:p/>
-    <w:p/>
-    <w:p/>
-    <w:p/>
-    <w:p/>
-    <w:p/>
-    <w:p/>
-    <w:p/>
-    <w:p/>
-    <w:p/>
-    <w:p/>
-    <w:p/>
-    <w:p/>
-    <w:p/>
-    <w:p>
-      <w:r>
-        <w:t>Page nouveau client</w:t>
+      <w:r>
+        <w:t xml:space="preserve"> Modifier une facture</w:t>
+      </w:r>
+    </w:p>
+    <w:p/>
+    <w:p/>
+    <w:p/>
+    <w:p/>
+    <w:p/>
+    <w:p/>
+    <w:p/>
+    <w:p/>
+    <w:p/>
+    <w:p/>
+    <w:p/>
+    <w:p/>
+    <w:p/>
+    <w:p/>
+    <w:p/>
+    <w:p>
+      <w:r>
+        <w:t>Nouveau</w:t>
+      </w:r>
+      <w:r>
+        <w:t xml:space="preserve"> client</w:t>
       </w:r>
     </w:p>
     <w:p>
@@ -843,7 +942,7 @@
                     <pic:cNvPicPr/>
                   </pic:nvPicPr>
                   <pic:blipFill>
-                    <a:blip r:embed="rId15">
+                    <a:blip r:embed="rId16">
                       <a:extLst>
                         <a:ext uri="{28A0092B-C50C-407E-A947-70E740481C1C}">
                           <a14:useLocalDpi xmlns:a14="http://schemas.microsoft.com/office/drawing/2010/main" val="0"/>
@@ -887,7 +986,10 @@
     <w:p/>
     <w:p>
       <w:r>
-        <w:t>Page nouveau Vendeur</w:t>
+        <w:t>Nouveau</w:t>
+      </w:r>
+      <w:r>
+        <w:t xml:space="preserve"> Vendeur</w:t>
       </w:r>
     </w:p>
     <w:p>
@@ -916,7 +1018,7 @@
                     <pic:cNvPicPr/>
                   </pic:nvPicPr>
                   <pic:blipFill>
-                    <a:blip r:embed="rId16">
+                    <a:blip r:embed="rId17">
                       <a:extLst>
                         <a:ext uri="{28A0092B-C50C-407E-A947-70E740481C1C}">
                           <a14:useLocalDpi xmlns:a14="http://schemas.microsoft.com/office/drawing/2010/main" val="0"/>
@@ -965,7 +1067,10 @@
     <w:p/>
     <w:p>
       <w:r>
-        <w:t>Page nouvelles factures</w:t>
+        <w:t>Nouvelle</w:t>
+      </w:r>
+      <w:r>
+        <w:t xml:space="preserve"> facture</w:t>
       </w:r>
     </w:p>
     <w:p>
@@ -994,7 +1099,7 @@
                     <pic:cNvPicPr/>
                   </pic:nvPicPr>
                   <pic:blipFill>
-                    <a:blip r:embed="rId17">
+                    <a:blip r:embed="rId18">
                       <a:extLst>
                         <a:ext uri="{28A0092B-C50C-407E-A947-70E740481C1C}">
                           <a14:useLocalDpi xmlns:a14="http://schemas.microsoft.com/office/drawing/2010/main" val="0"/>
@@ -1089,7 +1194,7 @@
                     <pic:cNvPicPr/>
                   </pic:nvPicPr>
                   <pic:blipFill>
-                    <a:blip r:embed="rId18">
+                    <a:blip r:embed="rId19">
                       <a:extLst>
                         <a:ext uri="{28A0092B-C50C-407E-A947-70E740481C1C}">
                           <a14:useLocalDpi xmlns:a14="http://schemas.microsoft.com/office/drawing/2010/main" val="0"/>

</xml_diff>